<commit_message>
Evidence check v0.2, EG3 full-coverage run spec and tools, kernel increment specs, methodology wording fixes
Co-Authored-By: Claude Sonnet 5.5 <noreply@anthropic.com>
Claude-Session: https://claude.ai/code/session_01MnaF19gSWzaMiztLqS74jT
</commit_message>
<xml_diff>
--- a/egypt/final/EGYPT_Methodology_v1.6.docx
+++ b/egypt/final/EGYPT_Methodology_v1.6.docx
@@ -820,7 +820,7 @@
         <w:rPr>
           <w:b/>
         </w:rPr>
-        <w:t>This is the proportional IPPU row that this method removes.</w:t>
+        <w:t>For the CBAM block this proportional response is removed and replaced by the block calculation (Section 4); for non-block IPPU CPAT's response is kept.</w:t>
       </w:r>
     </w:p>
     <w:p>
@@ -871,7 +871,7 @@
         <w:t>Other CPAT quantities used</w:t>
       </w:r>
       <w:r>
-        <w:t xml:space="preserve"> (the scenario's own scenario, 2030):</w:t>
+        <w:t xml:space="preserve"> (the scenario's own CPAT run, 2030):</w:t>
       </w:r>
     </w:p>
     <w:p>
@@ -1590,26 +1590,7 @@
                 <w:b/>
                 <w:sz w:val="16"/>
               </w:rPr>
-              <w:t>removed</w:t>
-            </w:r>
-            <w:r>
-              <w:rPr>
-                <w:sz w:val="16"/>
-              </w:rPr>
-              <w:t xml:space="preserve"> (</w:t>
-            </w:r>
-            <w:r>
-              <w:rPr>
-                <w:rFonts w:ascii="Consolas" w:eastAsia="Consolas" w:hAnsi="Consolas"/>
-                <w:sz w:val="16"/>
-              </w:rPr>
-              <w:t>IppuOther</w:t>
-            </w:r>
-            <w:r>
-              <w:rPr>
-                <w:sz w:val="16"/>
-              </w:rPr>
-              <w:t xml:space="preserve"> = NONE)</w:t>
+              <w:t>removed for the CBAM block; kept for non-block IPPU</w:t>
             </w:r>
           </w:p>
         </w:tc>
@@ -2166,7 +2147,7 @@
               <w:rPr>
                 <w:sz w:val="16"/>
               </w:rPr>
-              <w:t>Product demand × pass-through × trade exposure. Cement demand −0.02 to −0.16 with pass-through 0.2–0.4 (EC / CE Delft–Oeko 2016); steel demand −0.2 to −0.3, pass-through about 0.5; Armington elasticities about 3–4 (GTAP); EU ETS firm studies find no detectable fall in output (Colmer et al. 2025). Only cement matters at USD 20/t: its carbon cost is 15% of its price, against 1–3% for the other goods.</w:t>
+              <w:t>Product demand × pass-through × trade exposure. Cement demand −0.02 to −0.16 with pass-through 0.2–0.4 (EC / CE Delft–Oeko 2016); steel pass-through 0.55–0.85 (no steel demand study located); Armington elasticities about 3–4 (GTAP); EU ETS firm studies find no detectable fall in output (Colmer et al. 2025). Only cement matters at USD 20/t: its carbon cost is 15% of its price, against 1–3% for the other goods.</w:t>
             </w:r>
           </w:p>
         </w:tc>

</xml_diff>